<commit_message>
Aggiorna Hub Gestionale e WaveGIS con nuove anteprime
</commit_message>
<xml_diff>
--- a/migliorie_del _sito.docx
+++ b/migliorie_del _sito.docx
@@ -11,11 +11,13 @@
       <w:pPr>
         <w:rPr>
           <w:b/>
-        </w:rPr>
-      </w:pPr>
-      <w:r>
-        <w:rPr>
-          <w:b/>
+          <w:strike/>
+        </w:rPr>
+      </w:pPr>
+      <w:r>
+        <w:rPr>
+          <w:b/>
+          <w:strike/>
         </w:rPr>
         <w:t>0. cambiare pagina download e privacy</w:t>
       </w:r>
@@ -24,359 +26,583 @@
       <w:pPr>
         <w:rPr>
           <w:b/>
-        </w:rPr>
-      </w:pPr>
-      <w:r>
-        <w:rPr>
-          <w:b/>
-        </w:rPr>
-        <w:t>1. Casi studio reali</w:t>
-      </w:r>
-    </w:p>
-    <w:p>
-      <w:r>
+          <w:strike/>
+        </w:rPr>
+      </w:pPr>
+      <w:r>
+        <w:rPr>
+          <w:b/>
+        </w:rPr>
+        <w:t xml:space="preserve">1. </w:t>
+      </w:r>
+      <w:r>
+        <w:rPr>
+          <w:b/>
+          <w:strike/>
+        </w:rPr>
+        <w:t>Casi studio reali</w:t>
+      </w:r>
+    </w:p>
+    <w:p>
+      <w:pPr>
+        <w:rPr>
+          <w:strike/>
+        </w:rPr>
+      </w:pPr>
+      <w:r>
+        <w:rPr>
+          <w:strike/>
+        </w:rPr>
         <w:t xml:space="preserve">   Aggiungere 2-3 progetti con problema, soluzione, tecnologie, immagini e risultato ottenuto. È l’elemento che più aiuterebbe sia SEO sia acquisizione clienti.</w:t>
       </w:r>
     </w:p>
+    <w:p>
+      <w:pPr>
+        <w:rPr>
+          <w:strike/>
+        </w:rPr>
+      </w:pPr>
+    </w:p>
+    <w:p>
+      <w:pPr>
+        <w:rPr>
+          <w:b/>
+          <w:strike/>
+        </w:rPr>
+      </w:pPr>
+      <w:r>
+        <w:rPr>
+          <w:b/>
+          <w:strike/>
+        </w:rPr>
+        <w:t>2. Pagine dedicate ai singoli servizi</w:t>
+      </w:r>
+    </w:p>
+    <w:p>
+      <w:pPr>
+        <w:rPr>
+          <w:strike/>
+        </w:rPr>
+      </w:pPr>
+      <w:r>
+        <w:rPr>
+          <w:strike/>
+        </w:rPr>
+        <w:t xml:space="preserve">   Creare pagine separate per:</w:t>
+      </w:r>
+    </w:p>
+    <w:p>
+      <w:pPr>
+        <w:rPr>
+          <w:strike/>
+        </w:rPr>
+      </w:pPr>
+      <w:r>
+        <w:rPr>
+          <w:strike/>
+        </w:rPr>
+        <w:t xml:space="preserve">   - automazioni </w:t>
+      </w:r>
+      <w:proofErr w:type="spellStart"/>
+      <w:r>
+        <w:rPr>
+          <w:strike/>
+        </w:rPr>
+        <w:t>Python</w:t>
+      </w:r>
+      <w:proofErr w:type="spellEnd"/>
+      <w:r>
+        <w:rPr>
+          <w:strike/>
+        </w:rPr>
+        <w:t>;</w:t>
+      </w:r>
+    </w:p>
+    <w:p>
+      <w:pPr>
+        <w:rPr>
+          <w:strike/>
+        </w:rPr>
+      </w:pPr>
+      <w:r>
+        <w:rPr>
+          <w:strike/>
+        </w:rPr>
+        <w:t xml:space="preserve">   - </w:t>
+      </w:r>
+      <w:proofErr w:type="spellStart"/>
+      <w:r>
+        <w:rPr>
+          <w:strike/>
+        </w:rPr>
+        <w:t>dashboard</w:t>
+      </w:r>
+      <w:proofErr w:type="spellEnd"/>
+      <w:r>
+        <w:rPr>
+          <w:strike/>
+        </w:rPr>
+        <w:t xml:space="preserve"> e analisi dati;</w:t>
+      </w:r>
+    </w:p>
+    <w:p>
+      <w:pPr>
+        <w:rPr>
+          <w:strike/>
+        </w:rPr>
+      </w:pPr>
+      <w:r>
+        <w:rPr>
+          <w:strike/>
+        </w:rPr>
+        <w:t xml:space="preserve">   - GIS e </w:t>
+      </w:r>
+      <w:proofErr w:type="spellStart"/>
+      <w:r>
+        <w:rPr>
+          <w:strike/>
+        </w:rPr>
+        <w:t>WebGIS</w:t>
+      </w:r>
+      <w:proofErr w:type="spellEnd"/>
+      <w:r>
+        <w:rPr>
+          <w:strike/>
+        </w:rPr>
+        <w:t>;</w:t>
+      </w:r>
+    </w:p>
+    <w:p>
+      <w:pPr>
+        <w:rPr>
+          <w:strike/>
+        </w:rPr>
+      </w:pPr>
+      <w:r>
+        <w:rPr>
+          <w:strike/>
+        </w:rPr>
+        <w:t xml:space="preserve">   - software e applicazioni web.</w:t>
+      </w:r>
+    </w:p>
+    <w:p>
+      <w:pPr>
+        <w:rPr>
+          <w:strike/>
+        </w:rPr>
+      </w:pPr>
+      <w:r>
+        <w:rPr>
+          <w:strike/>
+        </w:rPr>
+        <w:t xml:space="preserve">   Ogni pagina potrebbe intercettare ricerche specifiche molto meglio della pagina servizi generale.</w:t>
+      </w:r>
+    </w:p>
     <w:p/>
     <w:p>
       <w:pPr>
         <w:rPr>
           <w:b/>
-        </w:rPr>
-      </w:pPr>
-      <w:r>
-        <w:rPr>
-          <w:b/>
-        </w:rPr>
-        <w:t>2. Pagine dedicate ai singoli servizi</w:t>
-      </w:r>
-    </w:p>
-    <w:p>
-      <w:r>
-        <w:t xml:space="preserve">   Creare pagine separate per:</w:t>
+          <w:strike/>
+        </w:rPr>
+      </w:pPr>
+      <w:r>
+        <w:rPr>
+          <w:b/>
+          <w:strike/>
+        </w:rPr>
+        <w:t>3. Contatto più immediato</w:t>
+      </w:r>
+    </w:p>
+    <w:p>
+      <w:pPr>
+        <w:rPr>
+          <w:strike/>
+        </w:rPr>
+      </w:pPr>
+      <w:r>
+        <w:rPr>
+          <w:strike/>
+        </w:rPr>
+        <w:t xml:space="preserve">   Attualmente le CTA aprono l’email. Un piccolo modulo con nome, azienda, esigenza e contatto ridurrebbe l’attrito. Utile anche un collegamento per prenotare una breve call.</w:t>
+      </w:r>
+    </w:p>
+    <w:p>
+      <w:pPr>
+        <w:rPr>
+          <w:b/>
+        </w:rPr>
+      </w:pPr>
+    </w:p>
+    <w:p>
+      <w:pPr>
+        <w:rPr>
+          <w:b/>
+        </w:rPr>
+      </w:pPr>
+      <w:r>
+        <w:rPr>
+          <w:b/>
+        </w:rPr>
+        <w:t>4. Più elementi di fiducia</w:t>
+      </w:r>
+    </w:p>
+    <w:p>
+      <w:r>
+        <w:t xml:space="preserve">   Inserire una sezione “Chi sono”, esperienza, tecnologie realmente utilizzate, </w:t>
+      </w:r>
+      <w:proofErr w:type="spellStart"/>
+      <w:r>
+        <w:t>LinkedIn</w:t>
+      </w:r>
+      <w:proofErr w:type="spellEnd"/>
+      <w:r>
+        <w:t>, modalità di lavoro e tipologie di clienti serviti. Eventuali testimonianze devono essere autentiche e verificabili.</w:t>
+      </w:r>
+    </w:p>
+    <w:p>
+      <w:r>
+        <w:t>SEO e contenuti</w:t>
+      </w:r>
+    </w:p>
+    <w:p/>
+    <w:p>
+      <w:pPr>
+        <w:rPr>
+          <w:b/>
+          <w:strike/>
+        </w:rPr>
+      </w:pPr>
+      <w:r>
+        <w:rPr>
+          <w:b/>
+          <w:strike/>
+        </w:rPr>
+        <w:t>5. Contenuti orientati ai problemi cercati</w:t>
+      </w:r>
+    </w:p>
+    <w:p>
+      <w:pPr>
+        <w:rPr>
+          <w:strike/>
+        </w:rPr>
+      </w:pPr>
+      <w:r>
+        <w:rPr>
+          <w:strike/>
+        </w:rPr>
+        <w:t xml:space="preserve">   Articoli o guide come:</w:t>
+      </w:r>
+    </w:p>
+    <w:p>
+      <w:pPr>
+        <w:rPr>
+          <w:strike/>
+        </w:rPr>
+      </w:pPr>
+      <w:r>
+        <w:rPr>
+          <w:strike/>
+        </w:rPr>
+        <w:t xml:space="preserve">   - come automatizzare report Excel con </w:t>
+      </w:r>
+      <w:proofErr w:type="spellStart"/>
+      <w:r>
+        <w:rPr>
+          <w:strike/>
+        </w:rPr>
+        <w:t>Python</w:t>
+      </w:r>
+      <w:proofErr w:type="spellEnd"/>
+      <w:r>
+        <w:rPr>
+          <w:strike/>
+        </w:rPr>
+        <w:t>;</w:t>
+      </w:r>
+    </w:p>
+    <w:p>
+      <w:pPr>
+        <w:rPr>
+          <w:strike/>
+        </w:rPr>
+      </w:pPr>
+      <w:r>
+        <w:rPr>
+          <w:strike/>
+        </w:rPr>
+        <w:t xml:space="preserve">   - come centralizzare dati aziendali in una </w:t>
+      </w:r>
+      <w:proofErr w:type="spellStart"/>
+      <w:r>
+        <w:rPr>
+          <w:strike/>
+        </w:rPr>
+        <w:t>dashboard</w:t>
+      </w:r>
+      <w:proofErr w:type="spellEnd"/>
+      <w:r>
+        <w:rPr>
+          <w:strike/>
+        </w:rPr>
+        <w:t>;</w:t>
+      </w:r>
+    </w:p>
+    <w:p>
+      <w:pPr>
+        <w:rPr>
+          <w:strike/>
+        </w:rPr>
+      </w:pPr>
+      <w:r>
+        <w:rPr>
+          <w:strike/>
+        </w:rPr>
+        <w:t xml:space="preserve">   - integrazione tra QGIS e database;</w:t>
+      </w:r>
+    </w:p>
+    <w:p>
+      <w:pPr>
+        <w:rPr>
+          <w:strike/>
+        </w:rPr>
+      </w:pPr>
+      <w:r>
+        <w:rPr>
+          <w:strike/>
+        </w:rPr>
+        <w:t xml:space="preserve">   - quando conviene sviluppare un software su misura.</w:t>
+      </w:r>
+    </w:p>
+    <w:p>
+      <w:pPr>
+        <w:rPr>
+          <w:b/>
+          <w:strike/>
+        </w:rPr>
+      </w:pPr>
+    </w:p>
+    <w:p>
+      <w:pPr>
+        <w:rPr>
+          <w:b/>
+          <w:strike/>
+        </w:rPr>
+      </w:pPr>
+      <w:r>
+        <w:rPr>
+          <w:b/>
+          <w:strike/>
+        </w:rPr>
+        <w:t xml:space="preserve">6. Google </w:t>
+      </w:r>
+      <w:proofErr w:type="spellStart"/>
+      <w:r>
+        <w:rPr>
+          <w:b/>
+          <w:strike/>
+        </w:rPr>
+        <w:t>Search</w:t>
+      </w:r>
+      <w:proofErr w:type="spellEnd"/>
+      <w:r>
+        <w:rPr>
+          <w:b/>
+          <w:strike/>
+        </w:rPr>
+        <w:t xml:space="preserve"> Console</w:t>
+      </w:r>
+    </w:p>
+    <w:p>
+      <w:pPr>
+        <w:rPr>
+          <w:strike/>
+        </w:rPr>
+      </w:pPr>
+      <w:r>
+        <w:rPr>
+          <w:strike/>
+        </w:rPr>
+        <w:t xml:space="preserve">   Collegare il dominio, inviare sitemap.xml e controllare indicizzazione, </w:t>
+      </w:r>
+      <w:proofErr w:type="spellStart"/>
+      <w:r>
+        <w:rPr>
+          <w:strike/>
+        </w:rPr>
+        <w:t>query</w:t>
+      </w:r>
+      <w:proofErr w:type="spellEnd"/>
+      <w:r>
+        <w:rPr>
+          <w:strike/>
+        </w:rPr>
+        <w:t xml:space="preserve">, errori e Core Web </w:t>
+      </w:r>
+      <w:proofErr w:type="spellStart"/>
+      <w:r>
+        <w:rPr>
+          <w:strike/>
+        </w:rPr>
+        <w:t>Vitals</w:t>
+      </w:r>
+      <w:proofErr w:type="spellEnd"/>
+      <w:r>
+        <w:rPr>
+          <w:strike/>
+        </w:rPr>
+        <w:t xml:space="preserve">. Senza </w:t>
+      </w:r>
+      <w:proofErr w:type="spellStart"/>
+      <w:r>
+        <w:rPr>
+          <w:strike/>
+        </w:rPr>
+        <w:t>Search</w:t>
+      </w:r>
+      <w:proofErr w:type="spellEnd"/>
+      <w:r>
+        <w:rPr>
+          <w:strike/>
+        </w:rPr>
+        <w:t xml:space="preserve"> Console manca il riscontro concreto di Google.</w:t>
+      </w:r>
+    </w:p>
+    <w:p/>
+    <w:p>
+      <w:pPr>
+        <w:rPr>
+          <w:b/>
+        </w:rPr>
+      </w:pPr>
+      <w:r>
+        <w:rPr>
+          <w:b/>
+        </w:rPr>
+        <w:t>7. Profilo Google Business, se svolgi anche attività locale</w:t>
+      </w:r>
+    </w:p>
+    <w:p>
+      <w:r>
+        <w:t xml:space="preserve">   Può aiutare per ricerche geografiche, ma solo se esiste una sede o un’area di servizio realmente dichiarabile.</w:t>
+      </w:r>
+    </w:p>
+    <w:p>
+      <w:r>
+        <w:t>Esperienza e prestazioni</w:t>
+      </w:r>
+    </w:p>
+    <w:p/>
+    <w:p>
+      <w:pPr>
+        <w:rPr>
+          <w:b/>
+          <w:strike/>
+        </w:rPr>
+      </w:pPr>
+      <w:r>
+        <w:rPr>
+          <w:b/>
+        </w:rPr>
+        <w:t>8</w:t>
       </w:r>
       <w:bookmarkStart w:id="0" w:name="_GoBack"/>
-      <w:bookmarkEnd w:id="0"/>
-    </w:p>
-    <w:p>
-      <w:r>
-        <w:t xml:space="preserve">   - automazioni </w:t>
+      <w:r>
+        <w:rPr>
+          <w:b/>
+          <w:strike/>
+        </w:rPr>
+        <w:t>. Immagini più rappresentative</w:t>
+      </w:r>
+    </w:p>
+    <w:p>
+      <w:pPr>
+        <w:rPr>
+          <w:strike/>
+        </w:rPr>
+      </w:pPr>
+      <w:r>
+        <w:rPr>
+          <w:strike/>
+        </w:rPr>
+        <w:t xml:space="preserve">   Mostrare schermate reali di </w:t>
       </w:r>
       <w:proofErr w:type="spellStart"/>
       <w:r>
-        <w:t>Python</w:t>
+        <w:rPr>
+          <w:strike/>
+        </w:rPr>
+        <w:t>dashboard</w:t>
       </w:r>
       <w:proofErr w:type="spellEnd"/>
       <w:r>
-        <w:t>;</w:t>
-      </w:r>
-    </w:p>
-    <w:p>
-      <w:r>
-        <w:t xml:space="preserve">   - </w:t>
+        <w:rPr>
+          <w:strike/>
+        </w:rPr>
+        <w:t>, automazioni e progetti GIS. Le immagini attuali sono gradevoli, ma raccontano poco il risultato concreto.</w:t>
+      </w:r>
+    </w:p>
+    <w:bookmarkEnd w:id="0"/>
+    <w:p/>
+    <w:p>
+      <w:pPr>
+        <w:rPr>
+          <w:b/>
+          <w:strike/>
+        </w:rPr>
+      </w:pPr>
+      <w:r>
+        <w:rPr>
+          <w:b/>
+          <w:strike/>
+        </w:rPr>
+        <w:t>9. Ottimizzazione immagini</w:t>
+      </w:r>
+    </w:p>
+    <w:p>
+      <w:pPr>
+        <w:rPr>
+          <w:strike/>
+        </w:rPr>
+      </w:pPr>
+      <w:r>
+        <w:rPr>
+          <w:strike/>
+        </w:rPr>
+        <w:t xml:space="preserve">   Convertire le fotografie principali in </w:t>
       </w:r>
       <w:proofErr w:type="spellStart"/>
       <w:r>
-        <w:t>dashboard</w:t>
+        <w:rPr>
+          <w:strike/>
+        </w:rPr>
+        <w:t>WebP</w:t>
       </w:r>
       <w:proofErr w:type="spellEnd"/>
       <w:r>
-        <w:t xml:space="preserve"> e analisi dati;</w:t>
-      </w:r>
-    </w:p>
-    <w:p>
-      <w:r>
-        <w:t xml:space="preserve">   - GIS e </w:t>
+        <w:rPr>
+          <w:strike/>
+        </w:rPr>
+        <w:t xml:space="preserve">/AVIF, aggiungere versioni responsive e precaricare solo l’immagine </w:t>
       </w:r>
       <w:proofErr w:type="spellStart"/>
       <w:r>
-        <w:t>WebGIS</w:t>
+        <w:rPr>
+          <w:strike/>
+        </w:rPr>
+        <w:t>hero</w:t>
       </w:r>
       <w:proofErr w:type="spellEnd"/>
       <w:r>
-        <w:t>;</w:t>
-      </w:r>
-    </w:p>
-    <w:p>
-      <w:r>
-        <w:t xml:space="preserve">   - software e applicazioni web.</w:t>
-      </w:r>
-    </w:p>
-    <w:p>
-      <w:r>
-        <w:t xml:space="preserve">   Ogni pagina potrebbe intercettare ricerche specifiche molto meglio della pagina servizi generale.</w:t>
-      </w:r>
-    </w:p>
-    <w:p/>
-    <w:p>
-      <w:pPr>
-        <w:rPr>
-          <w:b/>
-        </w:rPr>
-      </w:pPr>
-      <w:r>
-        <w:rPr>
-          <w:b/>
-        </w:rPr>
-        <w:t>3. Contatto più immediato</w:t>
-      </w:r>
-    </w:p>
-    <w:p>
-      <w:r>
-        <w:t xml:space="preserve">   Attualmente le CTA aprono l’email. Un piccolo modulo con nome, azienda, esigenza e contatto ridurrebbe l’attrito. Utile anche un collegamento per prenotare una breve call.</w:t>
-      </w:r>
-    </w:p>
-    <w:p>
-      <w:pPr>
-        <w:rPr>
-          <w:b/>
-        </w:rPr>
-      </w:pPr>
-    </w:p>
-    <w:p>
-      <w:pPr>
-        <w:rPr>
-          <w:b/>
-        </w:rPr>
-      </w:pPr>
-      <w:r>
-        <w:rPr>
-          <w:b/>
-        </w:rPr>
-        <w:t>4. Più elementi di fiducia</w:t>
-      </w:r>
-    </w:p>
-    <w:p>
-      <w:r>
-        <w:t xml:space="preserve">   Inserire una sezione “Chi sono”, esperienza, tecnologie realmente utilizzate, </w:t>
-      </w:r>
-      <w:proofErr w:type="spellStart"/>
-      <w:r>
-        <w:t>LinkedIn</w:t>
-      </w:r>
-      <w:proofErr w:type="spellEnd"/>
-      <w:r>
-        <w:t>, modalità di lavoro e tipologie di clienti serviti. Eventuali testimonianze devono essere autentiche e verificabili.</w:t>
-      </w:r>
-    </w:p>
-    <w:p>
-      <w:r>
-        <w:t>SEO e contenuti</w:t>
-      </w:r>
-    </w:p>
-    <w:p/>
-    <w:p>
-      <w:pPr>
-        <w:rPr>
-          <w:b/>
-        </w:rPr>
-      </w:pPr>
-      <w:r>
-        <w:rPr>
-          <w:b/>
-        </w:rPr>
-        <w:t>5. Contenuti orientati ai problemi cercati</w:t>
-      </w:r>
-    </w:p>
-    <w:p>
-      <w:r>
-        <w:t xml:space="preserve">   Articoli o guide come:</w:t>
-      </w:r>
-    </w:p>
-    <w:p>
-      <w:r>
-        <w:t xml:space="preserve">   - come automatizzare report Excel con </w:t>
-      </w:r>
-      <w:proofErr w:type="spellStart"/>
-      <w:r>
-        <w:t>Python</w:t>
-      </w:r>
-      <w:proofErr w:type="spellEnd"/>
-      <w:r>
-        <w:t>;</w:t>
-      </w:r>
-    </w:p>
-    <w:p>
-      <w:r>
-        <w:t xml:space="preserve">   - come centralizzare dati aziendali in una </w:t>
-      </w:r>
-      <w:proofErr w:type="spellStart"/>
-      <w:r>
-        <w:t>dashboard</w:t>
-      </w:r>
-      <w:proofErr w:type="spellEnd"/>
-      <w:r>
-        <w:t>;</w:t>
-      </w:r>
-    </w:p>
-    <w:p>
-      <w:r>
-        <w:t xml:space="preserve">   - integrazione tra QGIS e database;</w:t>
-      </w:r>
-    </w:p>
-    <w:p>
-      <w:r>
-        <w:t xml:space="preserve">   - quando conviene sviluppare un software su misura.</w:t>
-      </w:r>
-    </w:p>
-    <w:p>
-      <w:pPr>
-        <w:rPr>
-          <w:b/>
-        </w:rPr>
-      </w:pPr>
-    </w:p>
-    <w:p>
-      <w:pPr>
-        <w:rPr>
-          <w:b/>
-        </w:rPr>
-      </w:pPr>
-      <w:r>
-        <w:rPr>
-          <w:b/>
-        </w:rPr>
-        <w:t xml:space="preserve">6. Google </w:t>
-      </w:r>
-      <w:proofErr w:type="spellStart"/>
-      <w:r>
-        <w:rPr>
-          <w:b/>
-        </w:rPr>
-        <w:t>Search</w:t>
-      </w:r>
-      <w:proofErr w:type="spellEnd"/>
-      <w:r>
-        <w:rPr>
-          <w:b/>
-        </w:rPr>
-        <w:t xml:space="preserve"> Console</w:t>
-      </w:r>
-    </w:p>
-    <w:p>
-      <w:r>
-        <w:t xml:space="preserve">   Collegare il dominio, inviare sitemap.xml e controllare indicizzazione, </w:t>
-      </w:r>
-      <w:proofErr w:type="spellStart"/>
-      <w:r>
-        <w:t>query</w:t>
-      </w:r>
-      <w:proofErr w:type="spellEnd"/>
-      <w:r>
-        <w:t xml:space="preserve">, errori e Core Web </w:t>
-      </w:r>
-      <w:proofErr w:type="spellStart"/>
-      <w:r>
-        <w:t>Vitals</w:t>
-      </w:r>
-      <w:proofErr w:type="spellEnd"/>
-      <w:r>
-        <w:t xml:space="preserve">. Senza </w:t>
-      </w:r>
-      <w:proofErr w:type="spellStart"/>
-      <w:r>
-        <w:t>Search</w:t>
-      </w:r>
-      <w:proofErr w:type="spellEnd"/>
-      <w:r>
-        <w:t xml:space="preserve"> Console manca il riscontro concreto di Google.</w:t>
-      </w:r>
-    </w:p>
-    <w:p/>
-    <w:p>
-      <w:pPr>
-        <w:rPr>
-          <w:b/>
-        </w:rPr>
-      </w:pPr>
-      <w:r>
-        <w:rPr>
-          <w:b/>
-        </w:rPr>
-        <w:t>7. Profilo Google Business, se svolgi anche attività locale</w:t>
-      </w:r>
-    </w:p>
-    <w:p>
-      <w:r>
-        <w:t xml:space="preserve">   Può aiutare per ricerche geografiche, ma solo se esiste una sede o un’area di servizio realmente dichiarabile.</w:t>
-      </w:r>
-    </w:p>
-    <w:p>
-      <w:r>
-        <w:t>Esperienza e prestazioni</w:t>
-      </w:r>
-    </w:p>
-    <w:p/>
-    <w:p>
-      <w:pPr>
-        <w:rPr>
-          <w:b/>
-        </w:rPr>
-      </w:pPr>
-      <w:r>
-        <w:rPr>
-          <w:b/>
-        </w:rPr>
-        <w:t>8. Immagini più rappresentative</w:t>
-      </w:r>
-    </w:p>
-    <w:p>
-      <w:r>
-        <w:t xml:space="preserve">   Mostrare schermate reali di </w:t>
-      </w:r>
-      <w:proofErr w:type="spellStart"/>
-      <w:r>
-        <w:t>dashboard</w:t>
-      </w:r>
-      <w:proofErr w:type="spellEnd"/>
-      <w:r>
-        <w:t>, automazioni e progetti GIS. Le immagini attuali sono gradevoli, ma raccontano poco il risultato concreto.</w:t>
-      </w:r>
-    </w:p>
-    <w:p/>
-    <w:p>
-      <w:pPr>
-        <w:rPr>
-          <w:b/>
-        </w:rPr>
-      </w:pPr>
-      <w:r>
-        <w:rPr>
-          <w:b/>
-        </w:rPr>
-        <w:t>9. Ottimizzazione immagini</w:t>
-      </w:r>
-    </w:p>
-    <w:p>
-      <w:r>
-        <w:t xml:space="preserve">   Convertire le fotografie principali in </w:t>
-      </w:r>
-      <w:proofErr w:type="spellStart"/>
-      <w:r>
-        <w:t>WebP</w:t>
-      </w:r>
-      <w:proofErr w:type="spellEnd"/>
-      <w:r>
-        <w:t xml:space="preserve">/AVIF, aggiungere versioni responsive e precaricare solo l’immagine </w:t>
-      </w:r>
-      <w:proofErr w:type="spellStart"/>
-      <w:r>
-        <w:t>hero</w:t>
-      </w:r>
-      <w:proofErr w:type="spellEnd"/>
-      <w:r>
+        <w:rPr>
+          <w:strike/>
+        </w:rPr>
         <w:t>. Migliorerebbe soprattutto il caricamento mobile.</w:t>
       </w:r>
     </w:p>
     <w:p>
       <w:r>
-        <w:t>10. Pagina download integrata nel nuovo design</w:t>
-      </w:r>
-    </w:p>
-    <w:p>
-      <w:r>
-        <w:t xml:space="preserve">    È ancora basata sul vecchio stile del sito. Andrebbe uniformata visivamente e arricchita con versione, data di aggiornamento, requisiti e documentazione del software.</w:t>
+        <w:t>.</w:t>
       </w:r>
     </w:p>
     <w:sectPr>

</xml_diff>